<commit_message>
docs: update all four reports with post-audit numbers and validation roadmap
</commit_message>
<xml_diff>
--- a/outputs/reports/GoEMed_Executive_Summary_Deepak_Badri_Summer2026.docx
+++ b/outputs/reports/GoEMed_Executive_Summary_Deepak_Badri_Summer2026.docx
@@ -280,7 +280,7 @@
           <w:sz w:val="22"/>
           <w:szCs w:val="22"/>
         </w:rPr>
-        <w:t xml:space="preserve">Bio_ClinicalBERT fine-tuned for multi-label prediction — macro AUROC 0.9857 across 11 conditions</w:t>
+        <w:t xml:space="preserve">Two models evaluated head-to-head — XGBoost (macro AUROC 0.9032 on learnable labels) vs. Bio_ClinicalBERT (macro AUROC 0.6788) across 11 conditions</w:t>
       </w:r>
     </w:p>
     <w:p>
@@ -547,7 +547,7 @@
                 <w:sz w:val="20"/>
                 <w:szCs w:val="20"/>
               </w:rPr>
-              <w:t xml:space="preserve">1.967</w:t>
+              <w:t xml:space="preserve">1.917</w:t>
             </w:r>
           </w:p>
         </w:tc>
@@ -606,7 +606,7 @@
                 <w:sz w:val="20"/>
                 <w:szCs w:val="20"/>
               </w:rPr>
-              <w:t xml:space="preserve">0.606</w:t>
+              <w:t xml:space="preserve">0.586</w:t>
             </w:r>
           </w:p>
         </w:tc>
@@ -665,7 +665,7 @@
                 <w:sz w:val="20"/>
                 <w:szCs w:val="20"/>
               </w:rPr>
-              <w:t xml:space="preserve">0.034 (normalized)</w:t>
+              <w:t xml:space="preserve">0.020 (normalized)</w:t>
             </w:r>
           </w:p>
         </w:tc>
@@ -724,7 +724,7 @@
                 <w:sz w:val="20"/>
                 <w:szCs w:val="20"/>
               </w:rPr>
-              <w:t xml:space="preserve">0.819</w:t>
+              <w:t xml:space="preserve">0.9032*</w:t>
             </w:r>
           </w:p>
         </w:tc>
@@ -783,7 +783,7 @@
                 <w:sz w:val="20"/>
                 <w:szCs w:val="20"/>
               </w:rPr>
-              <w:t xml:space="preserve">0.9857</w:t>
+              <w:t xml:space="preserve">0.6788</w:t>
             </w:r>
           </w:p>
         </w:tc>
@@ -802,7 +802,7 @@
                 <w:sz w:val="20"/>
                 <w:szCs w:val="20"/>
               </w:rPr>
-              <w:t xml:space="preserve">Beats XGBoost on all 11 ✅</w:t>
+              <w:t xml:space="preserve">Head-to-head vs. baseline</w:t>
             </w:r>
           </w:p>
         </w:tc>
@@ -823,7 +823,7 @@
                 <w:sz w:val="20"/>
                 <w:szCs w:val="20"/>
               </w:rPr>
-              <w:t xml:space="preserve">Power analysis — min dataset size</w:t>
+              <w:t xml:space="preserve">Learning curve — power analysis</w:t>
             </w:r>
           </w:p>
         </w:tc>
@@ -842,7 +842,7 @@
                 <w:sz w:val="20"/>
                 <w:szCs w:val="20"/>
               </w:rPr>
-              <w:t xml:space="preserve">~1,000 records</w:t>
+              <w:t xml:space="preserve">Evaluated at 5 sizes</w:t>
             </w:r>
           </w:p>
         </w:tc>
@@ -861,7 +861,7 @@
                 <w:sz w:val="20"/>
                 <w:szCs w:val="20"/>
               </w:rPr>
-              <w:t xml:space="preserve">SLM saturation point</w:t>
+              <w:t xml:space="preserve">Details in technical appendix</w:t>
             </w:r>
           </w:p>
         </w:tc>
@@ -901,7 +901,7 @@
                 <w:sz w:val="20"/>
                 <w:szCs w:val="20"/>
               </w:rPr>
-              <w:t xml:space="preserve">77.8%</w:t>
+              <w:t xml:space="preserve">72.4%</w:t>
             </w:r>
           </w:p>
         </w:tc>
@@ -960,7 +960,7 @@
                 <w:sz w:val="20"/>
                 <w:szCs w:val="20"/>
               </w:rPr>
-              <w:t xml:space="preserve">78.8%</w:t>
+              <w:t xml:space="preserve">87.9%</w:t>
             </w:r>
           </w:p>
         </w:tc>
@@ -979,7 +979,7 @@
                 <w:sz w:val="20"/>
                 <w:szCs w:val="20"/>
               </w:rPr>
-              <w:t xml:space="preserve">7 flags — all clinically justified</w:t>
+              <w:t xml:space="preserve">4 flags — all clinically justified</w:t>
             </w:r>
           </w:p>
         </w:tc>
@@ -1123,7 +1123,7 @@
           <w:sz w:val="22"/>
           <w:szCs w:val="22"/>
         </w:rPr>
-        <w:t xml:space="preserve">Four statistical tests confirmed the synthetic data faithfully represents real patient population patterns. The Frobenius norm (1.967 &lt; 2.0 threshold) confirmed preserved pairwise correlation structure. The propensity AUROC (0.606) showed a trained classifier can barely distinguish synthetic from real patients. Hotelling's T² (applied from Applied Multivariate Analysis coursework) confirmed multivariate mean equality across all features simultaneously. SHAP TreeSHAP analysis verified 77.8% clinical alignment — the model learned that HbA1c drives diabetes, creatinine drives CKD, and pack years drive COPD — not spurious correlations. A fairness audit across 33 demographic subgroup checks found all 7 flagged performance gaps have clinically justified explanations rooted in real epidemiology, not model bias.</w:t>
+        <w:t xml:space="preserve">Four statistical tests confirmed the synthetic data faithfully represents real patient population patterns. The Frobenius norm (1.917 &lt; 2.0 threshold) confirmed preserved pairwise correlation structure. The propensity AUROC (0.586) showed a trained classifier can barely distinguish synthetic from real patients. Hotelling's T² (applied from Applied Multivariate Analysis coursework) confirmed multivariate mean equality across all features simultaneously. SHAP TreeSHAP analysis verified 72.4% clinical alignment — the model learned that HbA1c drives diabetes, creatinine drives CKD, and pack years drive COPD — not spurious correlations. A fairness audit across 33 demographic subgroup checks found all 7 flagged performance gaps have clinically justified explanations rooted in real epidemiology, not model bias.</w:t>
       </w:r>
     </w:p>
     <w:p>
@@ -1270,6 +1270,24 @@
           <w:szCs w:val="22"/>
         </w:rPr>
         <w:t xml:space="preserve"/>
+      </w:r>
+    </w:p>
+    <w:p>
+      <w:pPr>
+        <w:pStyle w:val="ListParagraph"/>
+        <w:numPr>
+          <w:ilvl w:val="0"/>
+          <w:numId w:val="1"/>
+        </w:numPr>
+        <w:spacing w:after="40" w:before="40"/>
+        <w:ind w:left="720" w:hanging="360"/>
+      </w:pPr>
+      <w:r>
+        <w:rPr>
+          <w:sz w:val="22"/>
+          <w:szCs w:val="22"/>
+        </w:rPr>
+        <w:t xml:space="preserve">Rigorous v2 validation study: seal a later NHANES cycle from generator calibration, evaluate final model performance on it once, and directly compare against the published clinical equations (Framingham, ASCVD, FINDRISC) on the same real held-out data. This is the natural next research step and the highest-priority follow-up work.</w:t>
       </w:r>
     </w:p>
     <w:p>

</xml_diff>